<commit_message>
feat: horizontal tailoring options, last resume persistence, layout restructure
</commit_message>
<xml_diff>
--- a/last_tailored_resume.docx
+++ b/last_tailored_resume.docx
@@ -48,7 +48,7 @@
     <w:p>
       <w:pPr/>
       <w:r>
-        <w:t>Analytical Computer Science professional with hands-on experience using data to identify operational risks, improve performance, and influence leaders through clear reporting and recommendations. Proven ability to translate complex findings into actionable insights, partner cross-functionally, and drive measurable improvements in customer-facing operations. Strong foundation in SQL, Python, and data visualization with a continuous-improvement mindset.</w:t>
+        <w:t>Analytical professional with CarMax experience delivering data-driven insights, trend reporting, and recommendations that improve compliance and customer experience outcomes. Skilled in SQL, Python, and data visualization with strong communication and stakeholder partnership skills. Known for translating complex performance data into clear narratives that influence leaders and drive continuous improvement.</w:t>
       </w:r>
     </w:p>
     <w:p/>
@@ -63,7 +63,7 @@
     <w:p>
       <w:pPr/>
       <w:r>
-        <w:t>JavaScript / TypeScript; Python; SQL; Data Analysis &amp; Trend Reporting; Data Visualization; Microsoft Office (Excel, PowerPoint); Dashboarding &amp; KPI Tracking; Process Improvement; Stakeholder Communication &amp; Storytelling; Cross-Functional Collaboration; Git / GitHub; REST APIs / FastAPI; React / Next.js; HTML / CSS / Tailwind</w:t>
+        <w:t>SQL • Python • Data Analysis • Data Visualization • Trend Analysis &amp; Reporting • KPI Dashboards • Root Cause Analysis • Stakeholder Management • Executive-Ready Presentations • Microsoft Excel/PowerPoint • Git/GitHub • JavaScript/TypeScript • React/Next.js • REST APIs/FastAPI</w:t>
       </w:r>
     </w:p>
     <w:p/>
@@ -94,7 +94,7 @@
         <w:pStyle w:val="ListBullet"/>
       </w:pPr>
       <w:r>
-        <w:t>Analyzed Customer Experience Center (CEC) quality and compliance data to identify performance trends, root causes, and operational risk; delivered insights to support leadership decision-making.</w:t>
+        <w:t>Analyzed Customer Experience Center (CEC) quality and compliance performance, identifying trends, risks, and improvement opportunities to support operational excellence.</w:t>
       </w:r>
     </w:p>
     <w:p>
@@ -102,7 +102,7 @@
         <w:pStyle w:val="ListBullet"/>
       </w:pPr>
       <w:r>
-        <w:t>Partnered with Compliance Services and CEC stakeholders to design and implement the official CEC Audit Program, improving audit consistency, documentation standards, and operational transparency.</w:t>
+        <w:t>Partnered with Compliance Services and cross-functional CEC leaders to design and implement the official CEC Audit Program, improving audit consistency, governance, and transparency.</w:t>
       </w:r>
     </w:p>
     <w:p>
@@ -110,7 +110,7 @@
         <w:pStyle w:val="ListBullet"/>
       </w:pPr>
       <w:r>
-        <w:t>Reduced compliance opportunity rates by 23% by building recurring trend reports, surfacing drivers of defects, and recommending targeted process and coaching actions.</w:t>
+        <w:t>Reduced compliance opportunity rates by 23% by synthesizing audit results, producing recurring performance reporting, and delivering targeted, actionable recommendations to leadership.</w:t>
       </w:r>
     </w:p>
     <w:p>
@@ -118,7 +118,7 @@
         <w:pStyle w:val="ListBullet"/>
       </w:pPr>
       <w:r>
-        <w:t>Increased inbound QA evaluation scores by 9% by translating findings into clear, prioritized improvement opportunities and aligning recommendations with frontline workflows.</w:t>
+        <w:t>Increased inbound QA evaluation scores by 9% through root-cause analysis, insight-driven process improvements, and coaching recommendations aligned to customer experience goals.</w:t>
       </w:r>
     </w:p>
     <w:p>
@@ -126,7 +126,7 @@
         <w:pStyle w:val="ListBullet"/>
       </w:pPr>
       <w:r>
-        <w:t>Communicated analytic findings through concise written summaries and presentations, influencing cross-team adoption of changes and reinforcing continuous improvement.</w:t>
+        <w:t>Communicated analytic findings through clear written summaries and presentations, influencing prioritization of corrective actions and continuous improvement initiatives.</w:t>
       </w:r>
     </w:p>
     <w:p/>

</xml_diff>

<commit_message>
feat: added ATS panel for analytics on tailored resume and match to job description.
</commit_message>
<xml_diff>
--- a/last_tailored_resume.docx
+++ b/last_tailored_resume.docx
@@ -7,33 +7,19 @@
         <w:pStyle w:val="ResumeHeading"/>
       </w:pPr>
       <w:r>
-        <w:t>Antonio Lee Jr</w:t>
-      </w:r>
-    </w:p>
-    <w:p>
-      <w:pPr>
-        <w:pStyle w:val="ResumeHeading"/>
-      </w:pPr>
-      <w:r>
-        <w:t>Strategy &amp; Data Analyst | Richmond, Virginia</w:t>
+        <w:t>ANTONIO LEE</w:t>
       </w:r>
     </w:p>
     <w:p>
       <w:pPr/>
       <w:r>
-        <w:t>(804) 475-7759</w:t>
+        <w:t>aaleejr12@gmail.com | 804-475-7759 | Richmond, VA</w:t>
       </w:r>
     </w:p>
     <w:p>
       <w:pPr/>
       <w:r>
-        <w:t>techdudetony@gmail.com</w:t>
-      </w:r>
-    </w:p>
-    <w:p>
-      <w:pPr/>
-      <w:r>
-        <w:t>www.linkedin.com/in/antonioleejr</w:t>
+        <w:t>linkedin.com/in/antonioleejr | antoniolee.vercel.app | github.com/techdudetony</w:t>
       </w:r>
     </w:p>
     <w:p/>
@@ -48,7 +34,7 @@
     <w:p>
       <w:pPr/>
       <w:r>
-        <w:t>Analytical professional with CarMax experience delivering data-driven insights, trend reporting, and recommendations that improve compliance and customer experience outcomes. Skilled in SQL, Python, and data visualization with strong communication and stakeholder partnership skills. Known for translating complex performance data into clear narratives that influence leaders and drive continuous improvement.</w:t>
+        <w:t>Business analytics and quality assurance professional with 5+ years of experience analyzing multi-channel customer interaction data (phone, chat, email), identifying performance trends, and delivering actionable insights to improve customer experience, compliance, and operational efficiency. Skilled in Power BI and Excel for dashboarding, KPI reporting, and data storytelling; experienced partnering with cross-functional leaders to influence process improvements. Currently pursuing a B.S. in Computer Science (AI concentration) with strong curiosity, critical thinking, and continuous-improvement mindset.</w:t>
       </w:r>
     </w:p>
     <w:p/>
@@ -57,13 +43,13 @@
         <w:pStyle w:val="ResumeHeading"/>
       </w:pPr>
       <w:r>
-        <w:t>SKILLS</w:t>
+        <w:t>KEY SKILLS</w:t>
       </w:r>
     </w:p>
     <w:p>
       <w:pPr/>
       <w:r>
-        <w:t>SQL • Python • Data Analysis • Data Visualization • Trend Analysis &amp; Reporting • KPI Dashboards • Root Cause Analysis • Stakeholder Management • Executive-Ready Presentations • Microsoft Excel/PowerPoint • Git/GitHub • JavaScript/TypeScript • React/Next.js • REST APIs/FastAPI</w:t>
+        <w:t>Business Analytics | KPI &amp; Trend Analysis | Data Visualization | Power BI | Microsoft Excel (PivotTables, charts) | Reporting Accuracy &amp; Data Integrity | Performance Metrics (SLA, productivity) | Quality Assurance Auditing | Compliance Monitoring | Root Cause Analysis | Process Improvement | Cross-Functional Collaboration | Presentation &amp; Data Storytelling | Coaching &amp; Feedback | CRM &amp; Chat Systems | Microsoft 365 (Word, PowerPoint, Teams) | Google Workspace</w:t>
       </w:r>
     </w:p>
     <w:p/>
@@ -72,21 +58,13 @@
         <w:pStyle w:val="ResumeHeading"/>
       </w:pPr>
       <w:r>
-        <w:t>EXPERIENCE</w:t>
-      </w:r>
-    </w:p>
-    <w:p>
-      <w:pPr>
-        <w:pStyle w:val="ResumeHeading"/>
-      </w:pPr>
-      <w:r>
-        <w:t>Quality Assurance Consultant October 2020 - November 2025</w:t>
+        <w:t>WORK EXPERIENCE</w:t>
       </w:r>
     </w:p>
     <w:p>
       <w:pPr/>
       <w:r>
-        <w:t>CarMax, Richmond, Virginia</w:t>
+        <w:t>Quality Assurance Consultant - CarMax | Richmond, VA | 2020 - 2025</w:t>
       </w:r>
     </w:p>
     <w:p>
@@ -94,7 +72,7 @@
         <w:pStyle w:val="ListBullet"/>
       </w:pPr>
       <w:r>
-        <w:t>Analyzed Customer Experience Center (CEC) quality and compliance performance, identifying trends, risks, and improvement opportunities to support operational excellence.</w:t>
+        <w:t>Analyzed customer interactions across phone, chat, and email to evaluate quality standards, compliance requirements, and performance KPIs; documented findings with clear, repeatable scoring.</w:t>
       </w:r>
     </w:p>
     <w:p>
@@ -102,7 +80,7 @@
         <w:pStyle w:val="ListBullet"/>
       </w:pPr>
       <w:r>
-        <w:t>Partnered with Compliance Services and cross-functional CEC leaders to design and implement the official CEC Audit Program, improving audit consistency, governance, and transparency.</w:t>
+        <w:t>Built and maintained Excel and Power BI dashboards to visualize QA trends, channel performance, and recurring defect themes, improving visibility for leadership decision-making.</w:t>
       </w:r>
     </w:p>
     <w:p>
@@ -110,7 +88,7 @@
         <w:pStyle w:val="ListBullet"/>
       </w:pPr>
       <w:r>
-        <w:t>Reduced compliance opportunity rates by 23% by synthesizing audit results, producing recurring performance reporting, and delivering targeted, actionable recommendations to leadership.</w:t>
+        <w:t>Produced weekly/monthly reporting that translated complex QA results into concise insights and recommendations, supporting operational strategy and continuous improvement.</w:t>
       </w:r>
     </w:p>
     <w:p>
@@ -118,7 +96,7 @@
         <w:pStyle w:val="ListBullet"/>
       </w:pPr>
       <w:r>
-        <w:t>Increased inbound QA evaluation scores by 9% through root-cause analysis, insight-driven process improvements, and coaching recommendations aligned to customer experience goals.</w:t>
+        <w:t>Partnered with leadership, operations, and compliance stakeholders to validate findings, align on priorities, and influence process changes based on data.</w:t>
       </w:r>
     </w:p>
     <w:p>
@@ -126,7 +104,23 @@
         <w:pStyle w:val="ListBullet"/>
       </w:pPr>
       <w:r>
-        <w:t>Communicated analytic findings through clear written summaries and presentations, influencing prioritization of corrective actions and continuous improvement initiatives.</w:t>
+        <w:t>Improved QA evaluation accuracy by 9% by standardizing audit criteria and strengthening calibration practices; reduced compliance opportunities by 23% through targeted, data-driven feedback loops.</w:t>
+      </w:r>
+    </w:p>
+    <w:p>
+      <w:pPr>
+        <w:pStyle w:val="ListBullet"/>
+      </w:pPr>
+      <w:r>
+        <w:t>Ensured reporting accuracy and data integrity across multiple systems by reconciling source data, investigating outliers, and correcting discrepancies prior to distribution.</w:t>
+      </w:r>
+    </w:p>
+    <w:p>
+      <w:pPr>
+        <w:pStyle w:val="ListBullet"/>
+      </w:pPr>
+      <w:r>
+        <w:t>Contributed to audit program design by refining evaluation workflows and identifying measurable indicators to track performance over time.</w:t>
       </w:r>
     </w:p>
     <w:p/>
@@ -141,13 +135,20 @@
     <w:p>
       <w:pPr/>
       <w:r>
-        <w:t>Bachelor of Science in Computer Science (B.S.) - Artificial Intelligence Concentration February 2026</w:t>
+        <w:t>Bachelor of Science - Computer Science (AI Concentration) | Full Sail University | 2025 - 2026 (In Progress)</w:t>
       </w:r>
     </w:p>
     <w:p>
       <w:pPr/>
       <w:r>
-        <w:t>Full Sail University, Winter Park, FL</w:t>
+        <w:t>Member, National Society of Collegiate Scholars (NSCS)</w:t>
+      </w:r>
+    </w:p>
+    <w:p/>
+    <w:p>
+      <w:pPr/>
+      <w:r>
+        <w:t>Associate of Science - Computer Science | Full Sail University | 2023 - 2024</w:t>
       </w:r>
     </w:p>
     <w:p/>
@@ -156,15 +157,21 @@
         <w:pStyle w:val="ResumeHeading"/>
       </w:pPr>
       <w:r>
-        <w:t>AWARDS/RECOGNITIONS/VOLUNTEER WORK</w:t>
+        <w:t>MILITARY EXPERIENCE</w:t>
       </w:r>
     </w:p>
     <w:p>
       <w:pPr>
-        <w:pStyle w:val="ListBullet"/>
+        <w:pStyle w:val="ResumeHeading"/>
       </w:pPr>
       <w:r>
-        <w:t>National Society of Collegiate Scholars (NSCS) - Member.</w:t>
+        <w:t>U.S. Army | 2019 - 2020</w:t>
+      </w:r>
+    </w:p>
+    <w:p>
+      <w:pPr/>
+      <w:r>
+        <w:t>74D: CBRN Specialist</w:t>
       </w:r>
     </w:p>
     <w:sectPr>

</xml_diff>